<commit_message>
Vincular subtitulo al documento con validacion de máximo de caracteres
</commit_message>
<xml_diff>
--- a/Documento.docx
+++ b/Documento.docx
@@ -17,7 +17,21 @@
           <w:color w:val="000000"/>
           <w:sz w:val="104"/>
         </w:rPr>
-        <w:t>ddddddddddddddddddddddddddddddddddddddddddddaaaaaaaaaaaaaaaa</w:t>
+        <w:t>El Dios del Sexo</w:t>
+      </w:r>
+    </w:p>
+    <w:p>
+      <w:pPr>
+        <w:jc w:val="center"/>
+      </w:pPr>
+      <w:r>
+        <w:rPr>
+          <w:rFonts w:ascii="Arial" w:hAnsi="Arial" w:eastAsia="Arial"/>
+          <w:b w:val="0"/>
+          <w:color w:val="000000"/>
+          <w:sz w:val="32"/>
+        </w:rPr>
+        <w:t>Séptima Ediciónddddddddddddddddddddsssssssssssssssssssssssssssssssssssssssfffffffffffffffffffffffffffffffffffffffffaaaaaaaaaa</w:t>
       </w:r>
     </w:p>
     <w:sectPr>

</xml_diff>

<commit_message>
Vincular asignatura con validaciones máximo de caracteres
</commit_message>
<xml_diff>
--- a/Documento.docx
+++ b/Documento.docx
@@ -17,7 +17,7 @@
           <w:color w:val="000000"/>
           <w:sz w:val="104"/>
         </w:rPr>
-        <w:t>El Dios del Sexo</w:t>
+        <w:t>Dios del Sexo</w:t>
       </w:r>
     </w:p>
     <w:p>
@@ -31,7 +31,7 @@
           <w:color w:val="000000"/>
           <w:sz w:val="28"/>
         </w:rPr>
-        <w:t>Séptima Edixión</w:t>
+        <w:t>Séptima Edición</w:t>
       </w:r>
     </w:p>
     <w:p>
@@ -55,7 +55,7 @@
           <w:color w:val="000000"/>
           <w:sz w:val="28"/>
         </w:rPr>
-        <w:t>José Vyhmeister - Bayron Urrutia - Erick Herrera</w:t>
+        <w:t>Bayron Urrutia - José Ibarra - Erick Herrera</w:t>
       </w:r>
     </w:p>
     <w:p>
@@ -79,7 +79,31 @@
           <w:color w:val="000000"/>
           <w:sz w:val="28"/>
         </w:rPr>
-        <w:t>Elliana Mallén Gonzáles Gonzáles</w:t>
+        <w:t>Elliana Mallén González González</w:t>
+      </w:r>
+    </w:p>
+    <w:p>
+      <w:pPr>
+        <w:spacing w:before="0"/>
+        <w:jc w:val="left"/>
+      </w:pPr>
+      <w:r>
+        <w:rPr>
+          <w:rFonts w:ascii="Arial" w:hAnsi="Arial" w:eastAsia="Arial"/>
+          <w:b/>
+          <w:color w:val="000000"/>
+          <w:sz w:val="28"/>
+        </w:rPr>
+        <w:t xml:space="preserve">Asignatura: </w:t>
+      </w:r>
+      <w:r>
+        <w:rPr>
+          <w:rFonts w:ascii="Arial" w:hAnsi="Arial" w:eastAsia="Arial"/>
+          <w:b w:val="0"/>
+          <w:color w:val="000000"/>
+          <w:sz w:val="28"/>
+        </w:rPr>
+        <w:t>Ingeniería de Software</w:t>
       </w:r>
     </w:p>
     <w:sectPr>

</xml_diff>